<commit_message>
v9-style Node Panel modifying.
</commit_message>
<xml_diff>
--- a/Summery.docx
+++ b/Summery.docx
@@ -793,6 +793,33 @@
         </w:tc>
       </w:tr>
     </w:tbl>
+    <w:p/>
+    <w:p/>
+    <w:p>
+      <w:pPr>
+        <w:pBdr>
+          <w:bottom w:val="single" w:sz="12" w:space="1" w:color="auto"/>
+        </w:pBdr>
+      </w:pPr>
+    </w:p>
+    <w:p/>
+    <w:p/>
+    <w:p/>
+    <w:p/>
+    <w:p/>
+    <w:p/>
+    <w:p/>
+    <w:p/>
+    <w:p/>
+    <w:p/>
+    <w:p/>
+    <w:p/>
+    <w:p/>
+    <w:p/>
+    <w:p/>
+    <w:p/>
+    <w:p/>
+    <w:p/>
     <w:p/>
     <w:sectPr>
       <w:pgSz w:w="11906" w:h="16838"/>
@@ -1688,6 +1715,7 @@
   <w:style w:type="character" w:default="1" w:styleId="DefaultParagraphFont">
     <w:name w:val="Default Paragraph Font"/>
     <w:uiPriority w:val="1"/>
+    <w:semiHidden/>
     <w:unhideWhenUsed/>
   </w:style>
   <w:style w:type="table" w:default="1" w:styleId="TableNormal">

</xml_diff>